<commit_message>
docs(rapports): relecture E2/E3/E4 — chiffres à jour, style allégé
E3 : les chiffres de tests/couverture étaient restés figés avant les
correctifs faits pendant les sessions E4 (timeout DashboardService) et
E5 (404 sur paire inconnue) — recalculés en direct (39/54 tests,
54%/97% de couverture au lieu de 38/52%/96%).

E4 : colonne "Lignes" retirée du tableau des composants (peu
informative), tableau d'accessibilité WCAG remplacé par un résumé en
prose, anomalie du libellé "Password" retirée (trop mineure pour
représenter le seul bug documenté du rapport), tirets cadratins réduits
de 74 à 17 occurrences.

E2 : relecture manuelle déjà faite avant cette session (annexes
retirées, ajout LiteLLM) — le .docx est commité tel quel, script non
resynchronisé.

Co-Authored-By: Claude Sonnet 5 <noreply@anthropic.com>
</commit_message>
<xml_diff>
--- a/rapports/Rapport_Bloc2_Veille_Benchmark_Parametrage_IA.docx
+++ b/rapports/Rapport_Bloc2_Veille_Benchmark_Parametrage_IA.docx
@@ -190,16 +190,6 @@
       <w:r>
         <w:rPr/>
         <w:t>6. Sources consultées</w:t>
-      </w:r>
-    </w:p>
-    <w:p>
-      <w:pPr>
-        <w:pStyle w:val="Normal"/>
-        <w:rPr/>
-      </w:pPr>
-      <w:r>
-        <w:rPr/>
-        <w:t>Annexes</w:t>
       </w:r>
     </w:p>
     <w:p>
@@ -8392,16 +8382,6 @@
     </w:tbl>
     <w:p>
       <w:pPr>
-        <w:pStyle w:val="Normal"/>
-        <w:rPr/>
-      </w:pPr>
-      <w:r>
-        <w:rPr/>
-        <w:t>La documentation est rédigée en Markdown (titres hiérarchiques, listes, blocs de code), format consultable par un lecteur d'écran sans dépendre d'une mise en forme visuelle.</w:t>
-      </w:r>
-    </w:p>
-    <w:p>
-      <w:pPr>
         <w:pStyle w:val="Heading1"/>
         <w:spacing w:before="0" w:after="0"/>
         <w:rPr/>
@@ -8439,6 +8419,11 @@
       <w:r>
         <w:rPr/>
         <w:t>L'architecture retenue (XGBoost local pour la prédiction + Claude en POC complémentaire) répond aux contraintes de coût, reproductibilité et éco-responsabilité identifiées dans le benchmark, tout en laissant une porte ouverte à l'enrichissement de l'interface utilisateur par des synthèses en langage naturel.</w:t>
+      </w:r>
+    </w:p>
+    <w:p>
+      <w:r>
+        <w:t>Le paramétrage de C8 s'est aussi concrétisé par un proxy LiteLLM réellement déployé (§4.2.5), qui centralise le suivi de coût et de tokens et prépare l'ajout d'autres fournisseurs sans changer le code applicatif.</w:t>
       </w:r>
     </w:p>
     <w:p>
@@ -8754,1193 +8739,6 @@
       </w:r>
       <w:r>
         <w:br w:type="page"/>
-      </w:r>
-    </w:p>
-    <w:p>
-      <w:pPr>
-        <w:pStyle w:val="Heading1"/>
-        <w:spacing w:before="0" w:after="0"/>
-        <w:rPr/>
-      </w:pPr>
-      <w:r>
-        <w:rPr/>
-        <w:t>Annexes</w:t>
-      </w:r>
-    </w:p>
-    <w:p>
-      <w:pPr>
-        <w:pStyle w:val="Heading2"/>
-        <w:rPr/>
-      </w:pPr>
-      <w:r>
-        <w:rPr/>
-        <w:t>Annexe A — Expression de besoin (extrait benchmark)</w:t>
-      </w:r>
-    </w:p>
-    <w:p>
-      <w:pPr>
-        <w:pStyle w:val="Normal"/>
-        <w:rPr/>
-      </w:pPr>
-      <w:r>
-        <w:rPr/>
-        <w:t>Objectif : prédire la tendance du Bitcoin (hausse / baisse / stable) à court terme (24h) pour alimenter un outil d'aide à la décision.</w:t>
-        <w:br/>
-        <w:t>Contraintes : données OHLCV + Fear &amp; Greed Index ; latence &lt; 5 s ; budget limité ; reproductibilité ; éco-responsabilité.</w:t>
-      </w:r>
-    </w:p>
-    <w:p>
-      <w:pPr>
-        <w:pStyle w:val="Heading2"/>
-        <w:rPr/>
-      </w:pPr>
-      <w:r>
-        <w:rPr/>
-        <w:t>Annexe B — Grille d'adéquation fonctionnelle</w:t>
-      </w:r>
-    </w:p>
-    <w:tbl>
-      <w:tblPr>
-        <w:tblStyle w:val="TableGrid"/>
-        <w:tblW w:w="8640" w:type="dxa"/>
-        <w:jc w:val="center"/>
-        <w:tblInd w:w="0" w:type="dxa"/>
-        <w:tblLayout w:type="fixed"/>
-        <w:tblCellMar>
-          <w:top w:w="0" w:type="dxa"/>
-          <w:left w:w="108" w:type="dxa"/>
-          <w:bottom w:w="0" w:type="dxa"/>
-          <w:right w:w="108" w:type="dxa"/>
-        </w:tblCellMar>
-        <w:tblLook w:val="04a0" w:noHBand="0" w:noVBand="1" w:firstColumn="1" w:lastRow="0" w:lastColumn="0" w:firstRow="1"/>
-      </w:tblPr>
-      <w:tblGrid>
-        <w:gridCol w:w="2880"/>
-        <w:gridCol w:w="2880"/>
-        <w:gridCol w:w="2880"/>
-      </w:tblGrid>
-      <w:tr>
-        <w:trPr/>
-        <w:tc>
-          <w:tcPr>
-            <w:tcW w:w="2880" w:type="dxa"/>
-            <w:tcBorders/>
-            <w:shd w:fill="2E74B5" w:val="clear"/>
-          </w:tcPr>
-          <w:p>
-            <w:pPr>
-              <w:pStyle w:val="Normal"/>
-              <w:widowControl/>
-              <w:spacing w:before="0" w:after="120"/>
-              <w:jc w:val="center"/>
-              <w:rPr>
-                <w:rFonts w:eastAsia="ＭＳ 明朝" w:cs=""/>
-                <w:kern w:val="0"/>
-                <w:szCs w:val="22"/>
-                <w:lang w:val="en-US" w:eastAsia="en-US" w:bidi="ar-SA"/>
-              </w:rPr>
-            </w:pPr>
-            <w:r>
-              <w:rPr>
-                <w:rFonts w:eastAsia="ＭＳ 明朝" w:cs=""/>
-                <w:b/>
-                <w:color w:val="FFFFFF"/>
-                <w:kern w:val="0"/>
-                <w:sz w:val="18"/>
-                <w:szCs w:val="22"/>
-                <w:lang w:val="en-US" w:eastAsia="en-US" w:bidi="ar-SA"/>
-              </w:rPr>
-              <w:t>Fonction</w:t>
-            </w:r>
-          </w:p>
-        </w:tc>
-        <w:tc>
-          <w:tcPr>
-            <w:tcW w:w="2880" w:type="dxa"/>
-            <w:tcBorders/>
-            <w:shd w:fill="2E74B5" w:val="clear"/>
-          </w:tcPr>
-          <w:p>
-            <w:pPr>
-              <w:pStyle w:val="Normal"/>
-              <w:widowControl/>
-              <w:spacing w:before="0" w:after="120"/>
-              <w:jc w:val="center"/>
-              <w:rPr>
-                <w:rFonts w:eastAsia="ＭＳ 明朝" w:cs=""/>
-                <w:kern w:val="0"/>
-                <w:szCs w:val="22"/>
-                <w:lang w:val="en-US" w:eastAsia="en-US" w:bidi="ar-SA"/>
-              </w:rPr>
-            </w:pPr>
-            <w:r>
-              <w:rPr>
-                <w:rFonts w:eastAsia="ＭＳ 明朝" w:cs=""/>
-                <w:b/>
-                <w:color w:val="FFFFFF"/>
-                <w:kern w:val="0"/>
-                <w:sz w:val="18"/>
-                <w:szCs w:val="22"/>
-                <w:lang w:val="en-US" w:eastAsia="en-US" w:bidi="ar-SA"/>
-              </w:rPr>
-              <w:t>LLM</w:t>
-            </w:r>
-          </w:p>
-        </w:tc>
-        <w:tc>
-          <w:tcPr>
-            <w:tcW w:w="2880" w:type="dxa"/>
-            <w:tcBorders/>
-            <w:shd w:fill="2E74B5" w:val="clear"/>
-          </w:tcPr>
-          <w:p>
-            <w:pPr>
-              <w:pStyle w:val="Normal"/>
-              <w:widowControl/>
-              <w:spacing w:before="0" w:after="120"/>
-              <w:jc w:val="center"/>
-              <w:rPr>
-                <w:rFonts w:eastAsia="ＭＳ 明朝" w:cs=""/>
-                <w:kern w:val="0"/>
-                <w:szCs w:val="22"/>
-                <w:lang w:val="en-US" w:eastAsia="en-US" w:bidi="ar-SA"/>
-              </w:rPr>
-            </w:pPr>
-            <w:r>
-              <w:rPr>
-                <w:rFonts w:eastAsia="ＭＳ 明朝" w:cs=""/>
-                <w:b/>
-                <w:color w:val="FFFFFF"/>
-                <w:kern w:val="0"/>
-                <w:sz w:val="18"/>
-                <w:szCs w:val="22"/>
-                <w:lang w:val="en-US" w:eastAsia="en-US" w:bidi="ar-SA"/>
-              </w:rPr>
-              <w:t>ML Custom</w:t>
-            </w:r>
-          </w:p>
-        </w:tc>
-      </w:tr>
-      <w:tr>
-        <w:trPr/>
-        <w:tc>
-          <w:tcPr>
-            <w:tcW w:w="2880" w:type="dxa"/>
-            <w:tcBorders/>
-          </w:tcPr>
-          <w:p>
-            <w:pPr>
-              <w:pStyle w:val="Normal"/>
-              <w:widowControl/>
-              <w:spacing w:before="0" w:after="120"/>
-              <w:jc w:val="left"/>
-              <w:rPr>
-                <w:rFonts w:eastAsia="ＭＳ 明朝" w:cs=""/>
-                <w:kern w:val="0"/>
-                <w:szCs w:val="22"/>
-                <w:lang w:val="en-US" w:eastAsia="en-US" w:bidi="ar-SA"/>
-              </w:rPr>
-            </w:pPr>
-            <w:r>
-              <w:rPr>
-                <w:rFonts w:eastAsia="ＭＳ 明朝" w:cs=""/>
-                <w:kern w:val="0"/>
-                <w:sz w:val="18"/>
-                <w:szCs w:val="22"/>
-                <w:lang w:val="en-US" w:eastAsia="en-US" w:bidi="ar-SA"/>
-              </w:rPr>
-              <w:t>Prédiction quantitative</w:t>
-            </w:r>
-          </w:p>
-        </w:tc>
-        <w:tc>
-          <w:tcPr>
-            <w:tcW w:w="2880" w:type="dxa"/>
-            <w:tcBorders/>
-          </w:tcPr>
-          <w:p>
-            <w:pPr>
-              <w:pStyle w:val="Normal"/>
-              <w:widowControl/>
-              <w:spacing w:before="0" w:after="120"/>
-              <w:jc w:val="left"/>
-              <w:rPr>
-                <w:rFonts w:eastAsia="ＭＳ 明朝" w:cs=""/>
-                <w:kern w:val="0"/>
-                <w:szCs w:val="22"/>
-                <w:lang w:val="en-US" w:eastAsia="en-US" w:bidi="ar-SA"/>
-              </w:rPr>
-            </w:pPr>
-            <w:r>
-              <w:rPr>
-                <w:rFonts w:eastAsia="ＭＳ 明朝" w:cs=""/>
-                <w:kern w:val="0"/>
-                <w:sz w:val="18"/>
-                <w:szCs w:val="22"/>
-                <w:lang w:val="en-US" w:eastAsia="en-US" w:bidi="ar-SA"/>
-              </w:rPr>
-              <w:t>Non adapté</w:t>
-            </w:r>
-          </w:p>
-        </w:tc>
-        <w:tc>
-          <w:tcPr>
-            <w:tcW w:w="2880" w:type="dxa"/>
-            <w:tcBorders/>
-          </w:tcPr>
-          <w:p>
-            <w:pPr>
-              <w:pStyle w:val="Normal"/>
-              <w:widowControl/>
-              <w:spacing w:before="0" w:after="120"/>
-              <w:jc w:val="left"/>
-              <w:rPr>
-                <w:rFonts w:eastAsia="ＭＳ 明朝" w:cs=""/>
-                <w:kern w:val="0"/>
-                <w:szCs w:val="22"/>
-                <w:lang w:val="en-US" w:eastAsia="en-US" w:bidi="ar-SA"/>
-              </w:rPr>
-            </w:pPr>
-            <w:r>
-              <w:rPr>
-                <w:rFonts w:eastAsia="ＭＳ 明朝" w:cs=""/>
-                <w:kern w:val="0"/>
-                <w:sz w:val="18"/>
-                <w:szCs w:val="22"/>
-                <w:lang w:val="en-US" w:eastAsia="en-US" w:bidi="ar-SA"/>
-              </w:rPr>
-              <w:t>Conçu pour</w:t>
-            </w:r>
-          </w:p>
-        </w:tc>
-      </w:tr>
-      <w:tr>
-        <w:trPr/>
-        <w:tc>
-          <w:tcPr>
-            <w:tcW w:w="2880" w:type="dxa"/>
-            <w:tcBorders/>
-            <w:shd w:fill="D9E2F3" w:val="clear"/>
-          </w:tcPr>
-          <w:p>
-            <w:pPr>
-              <w:pStyle w:val="Normal"/>
-              <w:widowControl/>
-              <w:spacing w:before="0" w:after="120"/>
-              <w:jc w:val="left"/>
-              <w:rPr>
-                <w:rFonts w:eastAsia="ＭＳ 明朝" w:cs=""/>
-                <w:kern w:val="0"/>
-                <w:szCs w:val="22"/>
-                <w:lang w:val="en-US" w:eastAsia="en-US" w:bidi="ar-SA"/>
-              </w:rPr>
-            </w:pPr>
-            <w:r>
-              <w:rPr>
-                <w:rFonts w:eastAsia="ＭＳ 明朝" w:cs=""/>
-                <w:kern w:val="0"/>
-                <w:sz w:val="18"/>
-                <w:szCs w:val="22"/>
-                <w:lang w:val="en-US" w:eastAsia="en-US" w:bidi="ar-SA"/>
-              </w:rPr>
-              <w:t>Analyse qualitative</w:t>
-            </w:r>
-          </w:p>
-        </w:tc>
-        <w:tc>
-          <w:tcPr>
-            <w:tcW w:w="2880" w:type="dxa"/>
-            <w:tcBorders/>
-            <w:shd w:fill="D9E2F3" w:val="clear"/>
-          </w:tcPr>
-          <w:p>
-            <w:pPr>
-              <w:pStyle w:val="Normal"/>
-              <w:widowControl/>
-              <w:spacing w:before="0" w:after="120"/>
-              <w:jc w:val="left"/>
-              <w:rPr>
-                <w:rFonts w:eastAsia="ＭＳ 明朝" w:cs=""/>
-                <w:kern w:val="0"/>
-                <w:szCs w:val="22"/>
-                <w:lang w:val="en-US" w:eastAsia="en-US" w:bidi="ar-SA"/>
-              </w:rPr>
-            </w:pPr>
-            <w:r>
-              <w:rPr>
-                <w:rFonts w:eastAsia="ＭＳ 明朝" w:cs=""/>
-                <w:kern w:val="0"/>
-                <w:sz w:val="18"/>
-                <w:szCs w:val="22"/>
-                <w:lang w:val="en-US" w:eastAsia="en-US" w:bidi="ar-SA"/>
-              </w:rPr>
-              <w:t>Pertinent</w:t>
-            </w:r>
-          </w:p>
-        </w:tc>
-        <w:tc>
-          <w:tcPr>
-            <w:tcW w:w="2880" w:type="dxa"/>
-            <w:tcBorders/>
-            <w:shd w:fill="D9E2F3" w:val="clear"/>
-          </w:tcPr>
-          <w:p>
-            <w:pPr>
-              <w:pStyle w:val="Normal"/>
-              <w:widowControl/>
-              <w:spacing w:before="0" w:after="120"/>
-              <w:jc w:val="left"/>
-              <w:rPr>
-                <w:rFonts w:eastAsia="ＭＳ 明朝" w:cs=""/>
-                <w:kern w:val="0"/>
-                <w:szCs w:val="22"/>
-                <w:lang w:val="en-US" w:eastAsia="en-US" w:bidi="ar-SA"/>
-              </w:rPr>
-            </w:pPr>
-            <w:r>
-              <w:rPr>
-                <w:rFonts w:eastAsia="ＭＳ 明朝" w:cs=""/>
-                <w:kern w:val="0"/>
-                <w:sz w:val="18"/>
-                <w:szCs w:val="22"/>
-                <w:lang w:val="en-US" w:eastAsia="en-US" w:bidi="ar-SA"/>
-              </w:rPr>
-              <w:t>Non prévu</w:t>
-            </w:r>
-          </w:p>
-        </w:tc>
-      </w:tr>
-      <w:tr>
-        <w:trPr/>
-        <w:tc>
-          <w:tcPr>
-            <w:tcW w:w="2880" w:type="dxa"/>
-            <w:tcBorders/>
-          </w:tcPr>
-          <w:p>
-            <w:pPr>
-              <w:pStyle w:val="Normal"/>
-              <w:widowControl/>
-              <w:spacing w:before="0" w:after="120"/>
-              <w:jc w:val="left"/>
-              <w:rPr>
-                <w:rFonts w:eastAsia="ＭＳ 明朝" w:cs=""/>
-                <w:kern w:val="0"/>
-                <w:szCs w:val="22"/>
-                <w:lang w:val="en-US" w:eastAsia="en-US" w:bidi="ar-SA"/>
-              </w:rPr>
-            </w:pPr>
-            <w:r>
-              <w:rPr>
-                <w:rFonts w:eastAsia="ＭＳ 明朝" w:cs=""/>
-                <w:kern w:val="0"/>
-                <w:sz w:val="18"/>
-                <w:szCs w:val="22"/>
-                <w:lang w:val="en-US" w:eastAsia="en-US" w:bidi="ar-SA"/>
-              </w:rPr>
-              <w:t>Synthèse actualités</w:t>
-            </w:r>
-          </w:p>
-        </w:tc>
-        <w:tc>
-          <w:tcPr>
-            <w:tcW w:w="2880" w:type="dxa"/>
-            <w:tcBorders/>
-          </w:tcPr>
-          <w:p>
-            <w:pPr>
-              <w:pStyle w:val="Normal"/>
-              <w:widowControl/>
-              <w:spacing w:before="0" w:after="120"/>
-              <w:jc w:val="left"/>
-              <w:rPr>
-                <w:rFonts w:eastAsia="ＭＳ 明朝" w:cs=""/>
-                <w:kern w:val="0"/>
-                <w:szCs w:val="22"/>
-                <w:lang w:val="en-US" w:eastAsia="en-US" w:bidi="ar-SA"/>
-              </w:rPr>
-            </w:pPr>
-            <w:r>
-              <w:rPr>
-                <w:rFonts w:eastAsia="ＭＳ 明朝" w:cs=""/>
-                <w:kern w:val="0"/>
-                <w:sz w:val="18"/>
-                <w:szCs w:val="22"/>
-                <w:lang w:val="en-US" w:eastAsia="en-US" w:bidi="ar-SA"/>
-              </w:rPr>
-              <w:t>Pertinent</w:t>
-            </w:r>
-          </w:p>
-        </w:tc>
-        <w:tc>
-          <w:tcPr>
-            <w:tcW w:w="2880" w:type="dxa"/>
-            <w:tcBorders/>
-          </w:tcPr>
-          <w:p>
-            <w:pPr>
-              <w:pStyle w:val="Normal"/>
-              <w:widowControl/>
-              <w:spacing w:before="0" w:after="120"/>
-              <w:jc w:val="left"/>
-              <w:rPr>
-                <w:rFonts w:eastAsia="ＭＳ 明朝" w:cs=""/>
-                <w:kern w:val="0"/>
-                <w:szCs w:val="22"/>
-                <w:lang w:val="en-US" w:eastAsia="en-US" w:bidi="ar-SA"/>
-              </w:rPr>
-            </w:pPr>
-            <w:r>
-              <w:rPr>
-                <w:rFonts w:eastAsia="ＭＳ 明朝" w:cs=""/>
-                <w:kern w:val="0"/>
-                <w:sz w:val="18"/>
-                <w:szCs w:val="22"/>
-                <w:lang w:val="en-US" w:eastAsia="en-US" w:bidi="ar-SA"/>
-              </w:rPr>
-              <w:t>Non prévu</w:t>
-            </w:r>
-          </w:p>
-        </w:tc>
-      </w:tr>
-      <w:tr>
-        <w:trPr/>
-        <w:tc>
-          <w:tcPr>
-            <w:tcW w:w="2880" w:type="dxa"/>
-            <w:tcBorders/>
-            <w:shd w:fill="D9E2F3" w:val="clear"/>
-          </w:tcPr>
-          <w:p>
-            <w:pPr>
-              <w:pStyle w:val="Normal"/>
-              <w:widowControl/>
-              <w:spacing w:before="0" w:after="120"/>
-              <w:jc w:val="left"/>
-              <w:rPr>
-                <w:rFonts w:eastAsia="ＭＳ 明朝" w:cs=""/>
-                <w:kern w:val="0"/>
-                <w:szCs w:val="22"/>
-                <w:lang w:val="en-US" w:eastAsia="en-US" w:bidi="ar-SA"/>
-              </w:rPr>
-            </w:pPr>
-            <w:r>
-              <w:rPr>
-                <w:rFonts w:eastAsia="ＭＳ 明朝" w:cs=""/>
-                <w:kern w:val="0"/>
-                <w:sz w:val="18"/>
-                <w:szCs w:val="22"/>
-                <w:lang w:val="en-US" w:eastAsia="en-US" w:bidi="ar-SA"/>
-              </w:rPr>
-              <w:t>Reproductibilité</w:t>
-            </w:r>
-          </w:p>
-        </w:tc>
-        <w:tc>
-          <w:tcPr>
-            <w:tcW w:w="2880" w:type="dxa"/>
-            <w:tcBorders/>
-            <w:shd w:fill="D9E2F3" w:val="clear"/>
-          </w:tcPr>
-          <w:p>
-            <w:pPr>
-              <w:pStyle w:val="Normal"/>
-              <w:widowControl/>
-              <w:spacing w:before="0" w:after="120"/>
-              <w:jc w:val="left"/>
-              <w:rPr>
-                <w:rFonts w:eastAsia="ＭＳ 明朝" w:cs=""/>
-                <w:kern w:val="0"/>
-                <w:szCs w:val="22"/>
-                <w:lang w:val="en-US" w:eastAsia="en-US" w:bidi="ar-SA"/>
-              </w:rPr>
-            </w:pPr>
-            <w:r>
-              <w:rPr>
-                <w:rFonts w:eastAsia="ＭＳ 明朝" w:cs=""/>
-                <w:kern w:val="0"/>
-                <w:sz w:val="18"/>
-                <w:szCs w:val="22"/>
-                <w:lang w:val="en-US" w:eastAsia="en-US" w:bidi="ar-SA"/>
-              </w:rPr>
-              <w:t>Non garanti</w:t>
-            </w:r>
-          </w:p>
-        </w:tc>
-        <w:tc>
-          <w:tcPr>
-            <w:tcW w:w="2880" w:type="dxa"/>
-            <w:tcBorders/>
-            <w:shd w:fill="D9E2F3" w:val="clear"/>
-          </w:tcPr>
-          <w:p>
-            <w:pPr>
-              <w:pStyle w:val="Normal"/>
-              <w:widowControl/>
-              <w:spacing w:before="0" w:after="120"/>
-              <w:jc w:val="left"/>
-              <w:rPr>
-                <w:rFonts w:eastAsia="ＭＳ 明朝" w:cs=""/>
-                <w:kern w:val="0"/>
-                <w:szCs w:val="22"/>
-                <w:lang w:val="en-US" w:eastAsia="en-US" w:bidi="ar-SA"/>
-              </w:rPr>
-            </w:pPr>
-            <w:r>
-              <w:rPr>
-                <w:rFonts w:eastAsia="ＭＳ 明朝" w:cs=""/>
-                <w:kern w:val="0"/>
-                <w:sz w:val="18"/>
-                <w:szCs w:val="22"/>
-                <w:lang w:val="en-US" w:eastAsia="en-US" w:bidi="ar-SA"/>
-              </w:rPr>
-              <w:t>Garanti</w:t>
-            </w:r>
-          </w:p>
-        </w:tc>
-      </w:tr>
-      <w:tr>
-        <w:trPr/>
-        <w:tc>
-          <w:tcPr>
-            <w:tcW w:w="2880" w:type="dxa"/>
-            <w:tcBorders/>
-          </w:tcPr>
-          <w:p>
-            <w:pPr>
-              <w:pStyle w:val="Normal"/>
-              <w:widowControl/>
-              <w:spacing w:before="0" w:after="120"/>
-              <w:jc w:val="left"/>
-              <w:rPr>
-                <w:rFonts w:eastAsia="ＭＳ 明朝" w:cs=""/>
-                <w:kern w:val="0"/>
-                <w:szCs w:val="22"/>
-                <w:lang w:val="en-US" w:eastAsia="en-US" w:bidi="ar-SA"/>
-              </w:rPr>
-            </w:pPr>
-            <w:r>
-              <w:rPr>
-                <w:rFonts w:eastAsia="ＭＳ 明朝" w:cs=""/>
-                <w:kern w:val="0"/>
-                <w:sz w:val="18"/>
-                <w:szCs w:val="22"/>
-                <w:lang w:val="en-US" w:eastAsia="en-US" w:bidi="ar-SA"/>
-              </w:rPr>
-              <w:t>Explicabilité</w:t>
-            </w:r>
-          </w:p>
-        </w:tc>
-        <w:tc>
-          <w:tcPr>
-            <w:tcW w:w="2880" w:type="dxa"/>
-            <w:tcBorders/>
-          </w:tcPr>
-          <w:p>
-            <w:pPr>
-              <w:pStyle w:val="Normal"/>
-              <w:widowControl/>
-              <w:spacing w:before="0" w:after="120"/>
-              <w:jc w:val="left"/>
-              <w:rPr>
-                <w:rFonts w:eastAsia="ＭＳ 明朝" w:cs=""/>
-                <w:kern w:val="0"/>
-                <w:szCs w:val="22"/>
-                <w:lang w:val="en-US" w:eastAsia="en-US" w:bidi="ar-SA"/>
-              </w:rPr>
-            </w:pPr>
-            <w:r>
-              <w:rPr>
-                <w:rFonts w:eastAsia="ＭＳ 明朝" w:cs=""/>
-                <w:kern w:val="0"/>
-                <w:sz w:val="18"/>
-                <w:szCs w:val="22"/>
-                <w:lang w:val="en-US" w:eastAsia="en-US" w:bidi="ar-SA"/>
-              </w:rPr>
-              <w:t>Textuel</w:t>
-            </w:r>
-          </w:p>
-        </w:tc>
-        <w:tc>
-          <w:tcPr>
-            <w:tcW w:w="2880" w:type="dxa"/>
-            <w:tcBorders/>
-          </w:tcPr>
-          <w:p>
-            <w:pPr>
-              <w:pStyle w:val="Normal"/>
-              <w:widowControl/>
-              <w:spacing w:before="0" w:after="120"/>
-              <w:jc w:val="left"/>
-              <w:rPr>
-                <w:rFonts w:eastAsia="ＭＳ 明朝" w:cs=""/>
-                <w:kern w:val="0"/>
-                <w:szCs w:val="22"/>
-                <w:lang w:val="en-US" w:eastAsia="en-US" w:bidi="ar-SA"/>
-              </w:rPr>
-            </w:pPr>
-            <w:r>
-              <w:rPr>
-                <w:rFonts w:eastAsia="ＭＳ 明朝" w:cs=""/>
-                <w:kern w:val="0"/>
-                <w:sz w:val="18"/>
-                <w:szCs w:val="22"/>
-                <w:lang w:val="en-US" w:eastAsia="en-US" w:bidi="ar-SA"/>
-              </w:rPr>
-              <w:t>Feature importance</w:t>
-            </w:r>
-          </w:p>
-        </w:tc>
-      </w:tr>
-    </w:tbl>
-    <w:p>
-      <w:pPr>
-        <w:pStyle w:val="Heading2"/>
-        <w:rPr/>
-      </w:pPr>
-      <w:r>
-        <w:rPr/>
-        <w:t>Annexe C — Exemple de prompt LLM</w:t>
-      </w:r>
-    </w:p>
-    <w:p>
-      <w:pPr>
-        <w:pStyle w:val="Normal"/>
-        <w:rPr/>
-      </w:pPr>
-      <w:r>
-        <w:rPr/>
-        <w:t>Tu es un analyste crypto. Voici les données des 30 derniers jours pour Bitcoin :</w:t>
-        <w:br/>
-        <w:t>- Fear &amp; Greed Index (score de 0 à 100)</w:t>
-        <w:br/>
-        <w:t>- Cours BTC en USD</w:t>
-        <w:br/>
-        <w:br/>
-        <w:t>[tableau fusionné date | score | sentiment | price]</w:t>
-        <w:br/>
-        <w:br/>
-        <w:t>En te basant uniquement sur ces données, prédis la tendance du Bitcoin pour les prochaines 24h en appelant l'outil submit_prediction.</w:t>
-        <w:br/>
-        <w:br/>
-        <w:t>Schéma de l'outil (tool use Anthropic, PREDICTION_TOOL) :</w:t>
-        <w:br/>
-        <w:t>prediction: HAUSSE | BAISSE | STABLE (enum, requis)</w:t>
-        <w:br/>
-        <w:t>confidence: entier 0-100 (requis)</w:t>
-        <w:br/>
-        <w:t>reason: texte court (requis)</w:t>
-      </w:r>
-    </w:p>
-    <w:p>
-      <w:pPr>
-        <w:pStyle w:val="Heading2"/>
-        <w:rPr/>
-      </w:pPr>
-      <w:r>
-        <w:rPr/>
-        <w:t>Annexe D — Configuration YAML Bloc3 (extrait)</w:t>
-      </w:r>
-    </w:p>
-    <w:p>
-      <w:pPr>
-        <w:pStyle w:val="Normal"/>
-        <w:rPr/>
-      </w:pPr>
-      <w:r>
-        <w:rPr/>
-        <w:t>Fichier config/ml_config.yaml :</w:t>
-        <w:br/>
-        <w:t xml:space="preserve">  classification_threshold: 0.005  # 0,5 % de variation</w:t>
-        <w:br/>
-        <w:t xml:space="preserve">  classes: {down: 0, stable: 1, up: 2}</w:t>
-        <w:br/>
-        <w:br/>
-        <w:t>Fichier config/day_models_config.yaml :</w:t>
-        <w:br/>
-        <w:t xml:space="preserve">  BTCUSDT:</w:t>
-        <w:br/>
-        <w:t xml:space="preserve">    model: XGBClassifier</w:t>
-        <w:br/>
-        <w:t xml:space="preserve">    train_start: '2020-01-01'</w:t>
-        <w:br/>
-        <w:t xml:space="preserve">    train_end: '2024-12-31'</w:t>
-        <w:br/>
-        <w:t xml:space="preserve">    test_start: '2025-01-01'</w:t>
-        <w:br/>
-        <w:t xml:space="preserve">    test_end: '2025-05-31'</w:t>
-      </w:r>
-    </w:p>
-    <w:p>
-      <w:pPr>
-        <w:pStyle w:val="Heading2"/>
-        <w:rPr/>
-      </w:pPr>
-      <w:r>
-        <w:rPr/>
-        <w:t>Annexe E — Commandes de lancement</w:t>
-      </w:r>
-    </w:p>
-    <w:tbl>
-      <w:tblPr>
-        <w:tblStyle w:val="TableGrid"/>
-        <w:tblW w:w="8640" w:type="dxa"/>
-        <w:jc w:val="center"/>
-        <w:tblInd w:w="0" w:type="dxa"/>
-        <w:tblLayout w:type="fixed"/>
-        <w:tblCellMar>
-          <w:top w:w="0" w:type="dxa"/>
-          <w:left w:w="108" w:type="dxa"/>
-          <w:bottom w:w="0" w:type="dxa"/>
-          <w:right w:w="108" w:type="dxa"/>
-        </w:tblCellMar>
-        <w:tblLook w:val="04a0" w:noHBand="0" w:noVBand="1" w:firstColumn="1" w:lastRow="0" w:lastColumn="0" w:firstRow="1"/>
-      </w:tblPr>
-      <w:tblGrid>
-        <w:gridCol w:w="4320"/>
-        <w:gridCol w:w="4319"/>
-      </w:tblGrid>
-      <w:tr>
-        <w:trPr/>
-        <w:tc>
-          <w:tcPr>
-            <w:tcW w:w="4320" w:type="dxa"/>
-            <w:tcBorders/>
-            <w:shd w:fill="2E74B5" w:val="clear"/>
-          </w:tcPr>
-          <w:p>
-            <w:pPr>
-              <w:pStyle w:val="Normal"/>
-              <w:widowControl/>
-              <w:spacing w:before="0" w:after="120"/>
-              <w:jc w:val="center"/>
-              <w:rPr>
-                <w:rFonts w:eastAsia="ＭＳ 明朝" w:cs=""/>
-                <w:kern w:val="0"/>
-                <w:szCs w:val="22"/>
-                <w:lang w:val="en-US" w:eastAsia="en-US" w:bidi="ar-SA"/>
-              </w:rPr>
-            </w:pPr>
-            <w:r>
-              <w:rPr>
-                <w:rFonts w:eastAsia="ＭＳ 明朝" w:cs=""/>
-                <w:b/>
-                <w:color w:val="FFFFFF"/>
-                <w:kern w:val="0"/>
-                <w:sz w:val="18"/>
-                <w:szCs w:val="22"/>
-                <w:lang w:val="en-US" w:eastAsia="en-US" w:bidi="ar-SA"/>
-              </w:rPr>
-              <w:t>Action</w:t>
-            </w:r>
-          </w:p>
-        </w:tc>
-        <w:tc>
-          <w:tcPr>
-            <w:tcW w:w="4319" w:type="dxa"/>
-            <w:tcBorders/>
-            <w:shd w:fill="2E74B5" w:val="clear"/>
-          </w:tcPr>
-          <w:p>
-            <w:pPr>
-              <w:pStyle w:val="Normal"/>
-              <w:widowControl/>
-              <w:spacing w:before="0" w:after="120"/>
-              <w:jc w:val="center"/>
-              <w:rPr>
-                <w:rFonts w:eastAsia="ＭＳ 明朝" w:cs=""/>
-                <w:kern w:val="0"/>
-                <w:szCs w:val="22"/>
-                <w:lang w:val="en-US" w:eastAsia="en-US" w:bidi="ar-SA"/>
-              </w:rPr>
-            </w:pPr>
-            <w:r>
-              <w:rPr>
-                <w:rFonts w:eastAsia="ＭＳ 明朝" w:cs=""/>
-                <w:b/>
-                <w:color w:val="FFFFFF"/>
-                <w:kern w:val="0"/>
-                <w:sz w:val="18"/>
-                <w:szCs w:val="22"/>
-                <w:lang w:val="en-US" w:eastAsia="en-US" w:bidi="ar-SA"/>
-              </w:rPr>
-              <w:t>Commande</w:t>
-            </w:r>
-          </w:p>
-        </w:tc>
-      </w:tr>
-      <w:tr>
-        <w:trPr/>
-        <w:tc>
-          <w:tcPr>
-            <w:tcW w:w="4320" w:type="dxa"/>
-            <w:tcBorders/>
-          </w:tcPr>
-          <w:p>
-            <w:pPr>
-              <w:pStyle w:val="Normal"/>
-              <w:widowControl/>
-              <w:spacing w:before="0" w:after="120"/>
-              <w:jc w:val="left"/>
-              <w:rPr>
-                <w:rFonts w:eastAsia="ＭＳ 明朝" w:cs=""/>
-                <w:kern w:val="0"/>
-                <w:szCs w:val="22"/>
-                <w:lang w:val="en-US" w:eastAsia="en-US" w:bidi="ar-SA"/>
-              </w:rPr>
-            </w:pPr>
-            <w:r>
-              <w:rPr>
-                <w:rFonts w:eastAsia="ＭＳ 明朝" w:cs=""/>
-                <w:kern w:val="0"/>
-                <w:sz w:val="18"/>
-                <w:szCs w:val="22"/>
-                <w:lang w:val="en-US" w:eastAsia="en-US" w:bidi="ar-SA"/>
-              </w:rPr>
-              <w:t>Veille Fear &amp; Greed</w:t>
-            </w:r>
-          </w:p>
-        </w:tc>
-        <w:tc>
-          <w:tcPr>
-            <w:tcW w:w="4319" w:type="dxa"/>
-            <w:tcBorders/>
-          </w:tcPr>
-          <w:p>
-            <w:pPr>
-              <w:pStyle w:val="Normal"/>
-              <w:widowControl/>
-              <w:spacing w:before="0" w:after="120"/>
-              <w:jc w:val="left"/>
-              <w:rPr>
-                <w:rFonts w:eastAsia="ＭＳ 明朝" w:cs=""/>
-                <w:kern w:val="0"/>
-                <w:szCs w:val="22"/>
-                <w:lang w:val="en-US" w:eastAsia="en-US" w:bidi="ar-SA"/>
-              </w:rPr>
-            </w:pPr>
-            <w:r>
-              <w:rPr>
-                <w:rFonts w:eastAsia="ＭＳ 明朝" w:cs=""/>
-                <w:kern w:val="0"/>
-                <w:sz w:val="18"/>
-                <w:szCs w:val="22"/>
-                <w:lang w:val="en-US" w:eastAsia="en-US" w:bidi="ar-SA"/>
-              </w:rPr>
-              <w:t>cd Bloc2_veille &amp;&amp; uv run python parametrage.py</w:t>
-            </w:r>
-          </w:p>
-        </w:tc>
-      </w:tr>
-      <w:tr>
-        <w:trPr/>
-        <w:tc>
-          <w:tcPr>
-            <w:tcW w:w="4320" w:type="dxa"/>
-            <w:tcBorders/>
-            <w:shd w:fill="D9E2F3" w:val="clear"/>
-          </w:tcPr>
-          <w:p>
-            <w:pPr>
-              <w:pStyle w:val="Normal"/>
-              <w:widowControl/>
-              <w:spacing w:before="0" w:after="120"/>
-              <w:jc w:val="left"/>
-              <w:rPr>
-                <w:rFonts w:eastAsia="ＭＳ 明朝" w:cs=""/>
-                <w:kern w:val="0"/>
-                <w:szCs w:val="22"/>
-                <w:lang w:val="en-US" w:eastAsia="en-US" w:bidi="ar-SA"/>
-              </w:rPr>
-            </w:pPr>
-            <w:r>
-              <w:rPr>
-                <w:rFonts w:eastAsia="ＭＳ 明朝" w:cs=""/>
-                <w:kern w:val="0"/>
-                <w:sz w:val="18"/>
-                <w:szCs w:val="22"/>
-                <w:lang w:val="en-US" w:eastAsia="en-US" w:bidi="ar-SA"/>
-              </w:rPr>
-              <w:t>POC LLM Streamlit</w:t>
-            </w:r>
-          </w:p>
-        </w:tc>
-        <w:tc>
-          <w:tcPr>
-            <w:tcW w:w="4319" w:type="dxa"/>
-            <w:tcBorders/>
-            <w:shd w:fill="D9E2F3" w:val="clear"/>
-          </w:tcPr>
-          <w:p>
-            <w:pPr>
-              <w:pStyle w:val="Normal"/>
-              <w:widowControl/>
-              <w:spacing w:before="0" w:after="120"/>
-              <w:jc w:val="left"/>
-              <w:rPr>
-                <w:rFonts w:eastAsia="ＭＳ 明朝" w:cs=""/>
-                <w:kern w:val="0"/>
-                <w:szCs w:val="22"/>
-                <w:lang w:val="en-US" w:eastAsia="en-US" w:bidi="ar-SA"/>
-              </w:rPr>
-            </w:pPr>
-            <w:r>
-              <w:rPr>
-                <w:rFonts w:eastAsia="ＭＳ 明朝" w:cs=""/>
-                <w:kern w:val="0"/>
-                <w:sz w:val="18"/>
-                <w:szCs w:val="22"/>
-                <w:lang w:val="en-US" w:eastAsia="en-US" w:bidi="ar-SA"/>
-              </w:rPr>
-              <w:t>cd Bloc2_veille &amp;&amp; uv run streamlit run app_benchmark.py</w:t>
-            </w:r>
-          </w:p>
-        </w:tc>
-      </w:tr>
-      <w:tr>
-        <w:trPr/>
-        <w:tc>
-          <w:tcPr>
-            <w:tcW w:w="4320" w:type="dxa"/>
-            <w:tcBorders/>
-          </w:tcPr>
-          <w:p>
-            <w:pPr>
-              <w:pStyle w:val="Normal"/>
-              <w:widowControl/>
-              <w:spacing w:before="0" w:after="120"/>
-              <w:jc w:val="left"/>
-              <w:rPr>
-                <w:rFonts w:eastAsia="ＭＳ 明朝" w:cs=""/>
-                <w:kern w:val="0"/>
-                <w:szCs w:val="22"/>
-                <w:lang w:val="en-US" w:eastAsia="en-US" w:bidi="ar-SA"/>
-              </w:rPr>
-            </w:pPr>
-            <w:r>
-              <w:rPr>
-                <w:rFonts w:eastAsia="ＭＳ 明朝" w:cs=""/>
-                <w:kern w:val="0"/>
-                <w:sz w:val="18"/>
-                <w:szCs w:val="22"/>
-                <w:lang w:val="en-US" w:eastAsia="en-US" w:bidi="ar-SA"/>
-              </w:rPr>
-              <w:t>Scraping actualités</w:t>
-            </w:r>
-          </w:p>
-        </w:tc>
-        <w:tc>
-          <w:tcPr>
-            <w:tcW w:w="4319" w:type="dxa"/>
-            <w:tcBorders/>
-          </w:tcPr>
-          <w:p>
-            <w:pPr>
-              <w:pStyle w:val="Normal"/>
-              <w:widowControl/>
-              <w:spacing w:before="0" w:after="120"/>
-              <w:jc w:val="left"/>
-              <w:rPr>
-                <w:rFonts w:eastAsia="ＭＳ 明朝" w:cs=""/>
-                <w:kern w:val="0"/>
-                <w:szCs w:val="22"/>
-                <w:lang w:val="en-US" w:eastAsia="en-US" w:bidi="ar-SA"/>
-              </w:rPr>
-            </w:pPr>
-            <w:r>
-              <w:rPr>
-                <w:rFonts w:eastAsia="ＭＳ 明朝" w:cs=""/>
-                <w:kern w:val="0"/>
-                <w:sz w:val="18"/>
-                <w:szCs w:val="22"/>
-                <w:lang w:val="en-US" w:eastAsia="en-US" w:bidi="ar-SA"/>
-              </w:rPr>
-              <w:t>cd Bloc1_data &amp;&amp; uv run scrapy crawl cointelegraph</w:t>
-            </w:r>
-          </w:p>
-        </w:tc>
-      </w:tr>
-      <w:tr>
-        <w:trPr/>
-        <w:tc>
-          <w:tcPr>
-            <w:tcW w:w="4320" w:type="dxa"/>
-            <w:tcBorders/>
-            <w:shd w:fill="D9E2F3" w:val="clear"/>
-          </w:tcPr>
-          <w:p>
-            <w:pPr>
-              <w:pStyle w:val="Normal"/>
-              <w:widowControl/>
-              <w:spacing w:before="0" w:after="120"/>
-              <w:jc w:val="left"/>
-              <w:rPr>
-                <w:rFonts w:eastAsia="ＭＳ 明朝" w:cs=""/>
-                <w:kern w:val="0"/>
-                <w:szCs w:val="22"/>
-                <w:lang w:val="en-US" w:eastAsia="en-US" w:bidi="ar-SA"/>
-              </w:rPr>
-            </w:pPr>
-            <w:r>
-              <w:rPr>
-                <w:rFonts w:eastAsia="ＭＳ 明朝" w:cs=""/>
-                <w:kern w:val="0"/>
-                <w:sz w:val="18"/>
-                <w:szCs w:val="22"/>
-                <w:lang w:val="en-US" w:eastAsia="en-US" w:bidi="ar-SA"/>
-              </w:rPr>
-              <w:t>Pipeline ML + MLflow</w:t>
-            </w:r>
-          </w:p>
-        </w:tc>
-        <w:tc>
-          <w:tcPr>
-            <w:tcW w:w="4319" w:type="dxa"/>
-            <w:tcBorders/>
-            <w:shd w:fill="D9E2F3" w:val="clear"/>
-          </w:tcPr>
-          <w:p>
-            <w:pPr>
-              <w:pStyle w:val="Normal"/>
-              <w:widowControl/>
-              <w:spacing w:before="0" w:after="120"/>
-              <w:jc w:val="left"/>
-              <w:rPr>
-                <w:rFonts w:eastAsia="ＭＳ 明朝" w:cs=""/>
-                <w:kern w:val="0"/>
-                <w:szCs w:val="22"/>
-                <w:lang w:val="en-US" w:eastAsia="en-US" w:bidi="ar-SA"/>
-              </w:rPr>
-            </w:pPr>
-            <w:r>
-              <w:rPr>
-                <w:rFonts w:eastAsia="ＭＳ 明朝" w:cs=""/>
-                <w:kern w:val="0"/>
-                <w:sz w:val="18"/>
-                <w:szCs w:val="22"/>
-                <w:lang w:val="en-US" w:eastAsia="en-US" w:bidi="ar-SA"/>
-              </w:rPr>
-              <w:t>docker compose up ml-pipeline mlflow-server ml-api -d</w:t>
-            </w:r>
-          </w:p>
-        </w:tc>
-      </w:tr>
-      <w:tr>
-        <w:trPr/>
-        <w:tc>
-          <w:tcPr>
-            <w:tcW w:w="4320" w:type="dxa"/>
-            <w:tcBorders/>
-          </w:tcPr>
-          <w:p>
-            <w:pPr>
-              <w:pStyle w:val="Normal"/>
-              <w:widowControl/>
-              <w:spacing w:before="0" w:after="120"/>
-              <w:jc w:val="left"/>
-              <w:rPr>
-                <w:rFonts w:eastAsia="ＭＳ 明朝" w:cs=""/>
-                <w:kern w:val="0"/>
-                <w:szCs w:val="22"/>
-                <w:lang w:val="en-US" w:eastAsia="en-US" w:bidi="ar-SA"/>
-              </w:rPr>
-            </w:pPr>
-            <w:r>
-              <w:rPr>
-                <w:rFonts w:eastAsia="ＭＳ 明朝" w:cs=""/>
-                <w:kern w:val="0"/>
-                <w:sz w:val="18"/>
-                <w:szCs w:val="22"/>
-                <w:lang w:val="en-US" w:eastAsia="en-US" w:bidi="ar-SA"/>
-              </w:rPr>
-              <w:t>Régénérer ce rapport</w:t>
-            </w:r>
-          </w:p>
-        </w:tc>
-        <w:tc>
-          <w:tcPr>
-            <w:tcW w:w="4319" w:type="dxa"/>
-            <w:tcBorders/>
-          </w:tcPr>
-          <w:p>
-            <w:pPr>
-              <w:pStyle w:val="Normal"/>
-              <w:widowControl/>
-              <w:spacing w:before="0" w:after="120"/>
-              <w:jc w:val="left"/>
-              <w:rPr>
-                <w:rFonts w:eastAsia="ＭＳ 明朝" w:cs=""/>
-                <w:kern w:val="0"/>
-                <w:szCs w:val="22"/>
-                <w:lang w:val="en-US" w:eastAsia="en-US" w:bidi="ar-SA"/>
-              </w:rPr>
-            </w:pPr>
-            <w:r>
-              <w:rPr>
-                <w:rFonts w:eastAsia="ＭＳ 明朝" w:cs=""/>
-                <w:kern w:val="0"/>
-                <w:sz w:val="18"/>
-                <w:szCs w:val="22"/>
-                <w:lang w:val="en-US" w:eastAsia="en-US" w:bidi="ar-SA"/>
-              </w:rPr>
-              <w:t>cd rapports &amp;&amp; .venv/bin/python generate_rapport_bloc2.py</w:t>
-            </w:r>
-          </w:p>
-        </w:tc>
-      </w:tr>
-    </w:tbl>
-    <w:p>
-      <w:pPr>
-        <w:pStyle w:val="Heading2"/>
-        <w:rPr/>
-      </w:pPr>
-      <w:r>
-        <w:rPr/>
-        <w:t>Annexe F — Cahier des charges du projet (extraits)</w:t>
-      </w:r>
-    </w:p>
-    <w:p>
-      <w:pPr>
-        <w:pStyle w:val="Normal"/>
-        <w:rPr/>
-      </w:pPr>
-      <w:r>
-        <w:rPr/>
-        <w:t>Transcription des extraits pertinents du cahier des charges du projet (docs/cahier_des_charges_classification_tendance.md), à l'origine du besoin fonctionnel reformulé en §3.1.</w:t>
-      </w:r>
-    </w:p>
-    <w:p>
-      <w:pPr>
-        <w:pStyle w:val="Normal"/>
-        <w:rPr/>
-      </w:pPr>
-      <w:r>
-        <w:rPr/>
-        <w:t>1.1 Objectif : Construire une plateforme complète de classification de tendance pour les cryptomonnaies. Le système prédit, pour chaque pas de temps (heure ou jour), si le prix va monter (UP), descendre (DOWN) ou rester stable (STABLE). C'est un problème de classification supervisée à 3 classes, contrairement à un problème de régression qui prédirait le prix exact.</w:t>
-      </w:r>
-    </w:p>
-    <w:p>
-      <w:pPr>
-        <w:pStyle w:val="Normal"/>
-        <w:rPr/>
-      </w:pPr>
-      <w:r>
-        <w:rPr/>
-        <w:t>1.2 Paires de trading suivies : BTC-USD (Bitcoin / US Dollar) et BTC-USDT (Bitcoin / Tether USDt), granularités horaire et journalière.</w:t>
-      </w:r>
-    </w:p>
-    <w:p>
-      <w:pPr>
-        <w:pStyle w:val="Normal"/>
-        <w:widowControl/>
-        <w:bidi w:val="0"/>
-        <w:spacing w:lineRule="auto" w:line="276" w:before="0" w:after="120"/>
-        <w:jc w:val="left"/>
-        <w:rPr/>
-      </w:pPr>
-      <w:r>
-        <w:rPr/>
-        <w:t>1.4 Définition de la variable cible : la cible est construite à partir de la variation relative du prix de clôture entre deux pas de temps consécutifs (variation = (close[t] - close[t-1]) / close[t-1]), avec un seuil configurable (0,5 % par défaut) : UP si variation &gt; +seuil, DOWN si variation &lt; -seuil, STABLE sinon. Le seuil est paramétrable en YAML pour être ajusté sans modifier le code.</w:t>
       </w:r>
     </w:p>
     <w:sectPr>

</xml_diff>